<commit_message>
Actualizacion en botones de Administracion en News.tsx
</commit_message>
<xml_diff>
--- a/MANUAL TÉCNICO Y DOCUMENTACIÓN PROYECTO INTU WEB 2.0.docx
+++ b/MANUAL TÉCNICO Y DOCUMENTACIÓN PROYECTO INTU WEB 2.0.docx
@@ -70,67 +70,7 @@
           <w:szCs w:val="24"/>
           <w:lang w:val="es-ES" w:eastAsia="es-ES"/>
         </w:rPr>
-        <w:t xml:space="preserve">El proyecto INTU WEB 2.0 es una plataforma moderna desarrollada para el Instituto Nacional de Tierras Urbanas. Utiliza una arquitectura de </w:t>
-      </w:r>
-      <w:proofErr w:type="spellStart"/>
-      <w:r>
-        <w:rPr>
-          <w:rFonts w:ascii="Arial" w:hAnsi="Arial" w:cs="Arial"/>
-          <w:sz w:val="24"/>
-          <w:szCs w:val="24"/>
-          <w:lang w:val="es-ES" w:eastAsia="es-ES"/>
-        </w:rPr>
-        <w:t>frontend</w:t>
-      </w:r>
-      <w:proofErr w:type="spellEnd"/>
-      <w:r>
-        <w:rPr>
-          <w:rFonts w:ascii="Arial" w:hAnsi="Arial" w:cs="Arial"/>
-          <w:sz w:val="24"/>
-          <w:szCs w:val="24"/>
-          <w:lang w:val="es-ES" w:eastAsia="es-ES"/>
-        </w:rPr>
-        <w:t xml:space="preserve"> basada en </w:t>
-      </w:r>
-      <w:proofErr w:type="spellStart"/>
-      <w:r>
-        <w:rPr>
-          <w:rFonts w:ascii="Arial" w:hAnsi="Arial" w:cs="Arial"/>
-          <w:sz w:val="24"/>
-          <w:szCs w:val="24"/>
-          <w:lang w:val="es-ES" w:eastAsia="es-ES"/>
-        </w:rPr>
-        <w:t>React</w:t>
-      </w:r>
-      <w:proofErr w:type="spellEnd"/>
-      <w:r>
-        <w:rPr>
-          <w:rFonts w:ascii="Arial" w:hAnsi="Arial" w:cs="Arial"/>
-          <w:sz w:val="24"/>
-          <w:szCs w:val="24"/>
-          <w:lang w:val="es-ES" w:eastAsia="es-ES"/>
-        </w:rPr>
-        <w:t xml:space="preserve"> y </w:t>
-      </w:r>
-      <w:proofErr w:type="spellStart"/>
-      <w:r>
-        <w:rPr>
-          <w:rFonts w:ascii="Arial" w:hAnsi="Arial" w:cs="Arial"/>
-          <w:sz w:val="24"/>
-          <w:szCs w:val="24"/>
-          <w:lang w:val="es-ES" w:eastAsia="es-ES"/>
-        </w:rPr>
-        <w:t>TypeScript</w:t>
-      </w:r>
-      <w:proofErr w:type="spellEnd"/>
-      <w:r>
-        <w:rPr>
-          <w:rFonts w:ascii="Arial" w:hAnsi="Arial" w:cs="Arial"/>
-          <w:sz w:val="24"/>
-          <w:szCs w:val="24"/>
-          <w:lang w:val="es-ES" w:eastAsia="es-ES"/>
-        </w:rPr>
-        <w:t>, diseñada para ser integrada en un ecosistema existente (Python/Django) mediante el uso de componentes modulares y una interfaz inteligente potenciada por IA.</w:t>
+        <w:t>El proyecto INTU WEB 2.0 es una plataforma moderna desarrollada para el Instituto Nacional de Tierras Urbanas. Utiliza una arquitectura de frontend basada en React y TypeScript, diseñada para ser integrada en un ecosistema existente (Python/Django) mediante el uso de componentes modulares y una interfaz inteligente potenciada por IA.</w:t>
       </w:r>
     </w:p>
     <w:p>
@@ -227,7 +167,6 @@
         </w:rPr>
         <w:t xml:space="preserve"> </w:t>
       </w:r>
-      <w:proofErr w:type="spellStart"/>
       <w:r>
         <w:rPr>
           <w:rFonts w:ascii="Arial" w:hAnsi="Arial" w:cs="Arial"/>
@@ -237,19 +176,7 @@
           <w:szCs w:val="24"/>
           <w:lang w:val="es-ES" w:eastAsia="es-ES"/>
         </w:rPr>
-        <w:t>TypeScript</w:t>
-      </w:r>
-      <w:proofErr w:type="spellEnd"/>
-      <w:r>
-        <w:rPr>
-          <w:rFonts w:ascii="Arial" w:hAnsi="Arial" w:cs="Arial"/>
-          <w:i/>
-          <w:iCs/>
-          <w:sz w:val="24"/>
-          <w:szCs w:val="24"/>
-          <w:lang w:val="es-ES" w:eastAsia="es-ES"/>
-        </w:rPr>
-        <w:t xml:space="preserve"> (TSX).</w:t>
+        <w:t>TypeScript (TSX).</w:t>
       </w:r>
       <w:r>
         <w:rPr>
@@ -297,7 +224,6 @@
         </w:rPr>
         <w:t xml:space="preserve"> </w:t>
       </w:r>
-      <w:proofErr w:type="spellStart"/>
       <w:r>
         <w:rPr>
           <w:rFonts w:ascii="Arial" w:hAnsi="Arial" w:cs="Arial"/>
@@ -307,19 +233,7 @@
           <w:szCs w:val="24"/>
           <w:lang w:val="es-ES" w:eastAsia="es-ES"/>
         </w:rPr>
-        <w:t>React</w:t>
-      </w:r>
-      <w:proofErr w:type="spellEnd"/>
-      <w:r>
-        <w:rPr>
-          <w:rFonts w:ascii="Arial" w:hAnsi="Arial" w:cs="Arial"/>
-          <w:i/>
-          <w:iCs/>
-          <w:sz w:val="24"/>
-          <w:szCs w:val="24"/>
-          <w:lang w:val="es-ES" w:eastAsia="es-ES"/>
-        </w:rPr>
-        <w:t xml:space="preserve"> 19.</w:t>
+        <w:t>React 19.</w:t>
       </w:r>
       <w:r>
         <w:rPr>
@@ -367,7 +281,6 @@
         </w:rPr>
         <w:t xml:space="preserve"> </w:t>
       </w:r>
-      <w:proofErr w:type="spellStart"/>
       <w:r>
         <w:rPr>
           <w:rFonts w:ascii="Arial" w:hAnsi="Arial" w:cs="Arial"/>
@@ -377,19 +290,7 @@
           <w:szCs w:val="24"/>
           <w:lang w:val="es-ES" w:eastAsia="es-ES"/>
         </w:rPr>
-        <w:t>Tailwind</w:t>
-      </w:r>
-      <w:proofErr w:type="spellEnd"/>
-      <w:r>
-        <w:rPr>
-          <w:rFonts w:ascii="Arial" w:hAnsi="Arial" w:cs="Arial"/>
-          <w:i/>
-          <w:iCs/>
-          <w:sz w:val="24"/>
-          <w:szCs w:val="24"/>
-          <w:lang w:val="es-ES" w:eastAsia="es-ES"/>
-        </w:rPr>
-        <w:t xml:space="preserve"> CSS.</w:t>
+        <w:t>Tailwind CSS.</w:t>
       </w:r>
       <w:r>
         <w:rPr>
@@ -446,31 +347,7 @@
           <w:szCs w:val="24"/>
           <w:lang w:val="es-ES" w:eastAsia="es-ES"/>
         </w:rPr>
-        <w:t>Lucide-</w:t>
-      </w:r>
-      <w:proofErr w:type="spellStart"/>
-      <w:r>
-        <w:rPr>
-          <w:rFonts w:ascii="Arial" w:hAnsi="Arial" w:cs="Arial"/>
-          <w:i/>
-          <w:iCs/>
-          <w:sz w:val="24"/>
-          <w:szCs w:val="24"/>
-          <w:lang w:val="es-ES" w:eastAsia="es-ES"/>
-        </w:rPr>
-        <w:t>React</w:t>
-      </w:r>
-      <w:proofErr w:type="spellEnd"/>
-      <w:r>
-        <w:rPr>
-          <w:rFonts w:ascii="Arial" w:hAnsi="Arial" w:cs="Arial"/>
-          <w:i/>
-          <w:iCs/>
-          <w:sz w:val="24"/>
-          <w:szCs w:val="24"/>
-          <w:lang w:val="es-ES" w:eastAsia="es-ES"/>
-        </w:rPr>
-        <w:t>.</w:t>
+        <w:t>Lucide-React.</w:t>
       </w:r>
       <w:r>
         <w:rPr>
@@ -596,8 +473,6 @@
         </w:rPr>
         <w:t xml:space="preserve"> y ejecutar la instalación de las dependencias declaradas en el archivo </w:t>
       </w:r>
-      <w:proofErr w:type="spellStart"/>
-      <w:proofErr w:type="gramStart"/>
       <w:r>
         <w:rPr>
           <w:rFonts w:ascii="Arial" w:hAnsi="Arial" w:cs="Arial"/>
@@ -609,8 +484,6 @@
         </w:rPr>
         <w:t>package.json</w:t>
       </w:r>
-      <w:proofErr w:type="spellEnd"/>
-      <w:proofErr w:type="gramEnd"/>
       <w:r>
         <w:rPr>
           <w:rFonts w:ascii="Arial" w:hAnsi="Arial" w:cs="Arial"/>
@@ -764,7 +637,6 @@
                 <w:lang w:val="es-ES" w:eastAsia="es-ES"/>
               </w:rPr>
             </w:pPr>
-            <w:proofErr w:type="spellStart"/>
             <w:r>
               <w:rPr>
                 <w:rFonts w:ascii="Arial" w:hAnsi="Arial" w:cs="Arial"/>
@@ -772,29 +644,8 @@
                 <w:szCs w:val="24"/>
                 <w:lang w:val="es-ES" w:eastAsia="es-ES"/>
               </w:rPr>
-              <w:t>npm</w:t>
+              <w:t>npm install</w:t>
             </w:r>
-            <w:proofErr w:type="spellEnd"/>
-            <w:r>
-              <w:rPr>
-                <w:rFonts w:ascii="Arial" w:hAnsi="Arial" w:cs="Arial"/>
-                <w:sz w:val="24"/>
-                <w:szCs w:val="24"/>
-                <w:lang w:val="es-ES" w:eastAsia="es-ES"/>
-              </w:rPr>
-              <w:t xml:space="preserve"> </w:t>
-            </w:r>
-            <w:proofErr w:type="spellStart"/>
-            <w:r>
-              <w:rPr>
-                <w:rFonts w:ascii="Arial" w:hAnsi="Arial" w:cs="Arial"/>
-                <w:sz w:val="24"/>
-                <w:szCs w:val="24"/>
-                <w:lang w:val="es-ES" w:eastAsia="es-ES"/>
-              </w:rPr>
-              <w:t>install</w:t>
-            </w:r>
-            <w:proofErr w:type="spellEnd"/>
           </w:p>
         </w:tc>
       </w:tr>
@@ -846,7 +697,6 @@
                 <w:lang w:val="es-ES" w:eastAsia="es-ES"/>
               </w:rPr>
             </w:pPr>
-            <w:proofErr w:type="spellStart"/>
             <w:r>
               <w:rPr>
                 <w:rFonts w:ascii="Arial" w:hAnsi="Arial" w:cs="Arial"/>
@@ -854,29 +704,8 @@
                 <w:szCs w:val="24"/>
                 <w:lang w:val="es-ES" w:eastAsia="es-ES"/>
               </w:rPr>
-              <w:t>npm</w:t>
+              <w:t>npm run dev</w:t>
             </w:r>
-            <w:proofErr w:type="spellEnd"/>
-            <w:r>
-              <w:rPr>
-                <w:rFonts w:ascii="Arial" w:hAnsi="Arial" w:cs="Arial"/>
-                <w:sz w:val="24"/>
-                <w:szCs w:val="24"/>
-                <w:lang w:val="es-ES" w:eastAsia="es-ES"/>
-              </w:rPr>
-              <w:t xml:space="preserve"> run </w:t>
-            </w:r>
-            <w:proofErr w:type="spellStart"/>
-            <w:r>
-              <w:rPr>
-                <w:rFonts w:ascii="Arial" w:hAnsi="Arial" w:cs="Arial"/>
-                <w:sz w:val="24"/>
-                <w:szCs w:val="24"/>
-                <w:lang w:val="es-ES" w:eastAsia="es-ES"/>
-              </w:rPr>
-              <w:t>dev</w:t>
-            </w:r>
-            <w:proofErr w:type="spellEnd"/>
           </w:p>
         </w:tc>
       </w:tr>
@@ -928,7 +757,6 @@
                 <w:lang w:val="es-ES" w:eastAsia="es-ES"/>
               </w:rPr>
             </w:pPr>
-            <w:proofErr w:type="spellStart"/>
             <w:r>
               <w:rPr>
                 <w:rFonts w:ascii="Arial" w:hAnsi="Arial" w:cs="Arial"/>
@@ -936,29 +764,8 @@
                 <w:szCs w:val="24"/>
                 <w:lang w:val="es-ES" w:eastAsia="es-ES"/>
               </w:rPr>
-              <w:t>npm</w:t>
+              <w:t>npm run build</w:t>
             </w:r>
-            <w:proofErr w:type="spellEnd"/>
-            <w:r>
-              <w:rPr>
-                <w:rFonts w:ascii="Arial" w:hAnsi="Arial" w:cs="Arial"/>
-                <w:sz w:val="24"/>
-                <w:szCs w:val="24"/>
-                <w:lang w:val="es-ES" w:eastAsia="es-ES"/>
-              </w:rPr>
-              <w:t xml:space="preserve"> run </w:t>
-            </w:r>
-            <w:proofErr w:type="spellStart"/>
-            <w:r>
-              <w:rPr>
-                <w:rFonts w:ascii="Arial" w:hAnsi="Arial" w:cs="Arial"/>
-                <w:sz w:val="24"/>
-                <w:szCs w:val="24"/>
-                <w:lang w:val="es-ES" w:eastAsia="es-ES"/>
-              </w:rPr>
-              <w:t>build</w:t>
-            </w:r>
-            <w:proofErr w:type="spellEnd"/>
           </w:p>
         </w:tc>
       </w:tr>
@@ -1108,7 +915,6 @@
                 <w:lang w:val="es-ES" w:eastAsia="es-ES"/>
               </w:rPr>
             </w:pPr>
-            <w:proofErr w:type="spellStart"/>
             <w:r>
               <w:rPr>
                 <w:rFonts w:ascii="Arial" w:hAnsi="Arial" w:cs="Arial"/>
@@ -1118,7 +924,6 @@
               </w:rPr>
               <w:t>react</w:t>
             </w:r>
-            <w:proofErr w:type="spellEnd"/>
           </w:p>
         </w:tc>
         <w:tc>
@@ -1206,19 +1011,8 @@
                 <w:szCs w:val="24"/>
                 <w:lang w:val="es-ES" w:eastAsia="es-ES"/>
               </w:rPr>
-              <w:t>lucide-</w:t>
+              <w:t>lucide-react</w:t>
             </w:r>
-            <w:proofErr w:type="spellStart"/>
-            <w:r>
-              <w:rPr>
-                <w:rFonts w:ascii="Arial" w:hAnsi="Arial" w:cs="Arial"/>
-                <w:sz w:val="24"/>
-                <w:szCs w:val="24"/>
-                <w:lang w:val="es-ES" w:eastAsia="es-ES"/>
-              </w:rPr>
-              <w:t>react</w:t>
-            </w:r>
-            <w:proofErr w:type="spellEnd"/>
           </w:p>
         </w:tc>
         <w:tc>
@@ -1458,6 +1252,71 @@
           </w:p>
         </w:tc>
       </w:tr>
+      <w:tr>
+        <w:tc>
+          <w:tcPr>
+            <w:tcW w:w="2831" w:type="dxa"/>
+            <w:vAlign w:val="center"/>
+          </w:tcPr>
+          <w:p>
+            <w:pPr>
+              <w:spacing w:line="360" w:lineRule="auto"/>
+              <w:jc w:val="both"/>
+              <w:rPr>
+                <w:rFonts w:ascii="Arial" w:hAnsi="Arial" w:cs="Arial"/>
+                <w:sz w:val="24"/>
+                <w:szCs w:val="24"/>
+                <w:lang w:val="es-ES" w:eastAsia="es-ES"/>
+              </w:rPr>
+            </w:pPr>
+            <w:r>
+              <w:rPr>
+                <w:rFonts w:ascii="Arial" w:hAnsi="Arial" w:cs="Arial"/>
+                <w:sz w:val="24"/>
+                <w:szCs w:val="24"/>
+                <w:lang w:val="es-ES" w:eastAsia="es-ES"/>
+              </w:rPr>
+              <w:t>react-router-dom</w:t>
+            </w:r>
+          </w:p>
+        </w:tc>
+        <w:tc>
+          <w:tcPr>
+            <w:tcW w:w="2831" w:type="dxa"/>
+            <w:vAlign w:val="center"/>
+          </w:tcPr>
+          <w:p>
+            <w:pPr>
+              <w:spacing w:line="360" w:lineRule="auto"/>
+              <w:jc w:val="both"/>
+              <w:rPr>
+                <w:rFonts w:ascii="Arial" w:hAnsi="Arial" w:cs="Arial"/>
+                <w:sz w:val="24"/>
+                <w:szCs w:val="24"/>
+                <w:lang w:val="es-ES" w:eastAsia="es-ES"/>
+              </w:rPr>
+            </w:pPr>
+          </w:p>
+        </w:tc>
+        <w:tc>
+          <w:tcPr>
+            <w:tcW w:w="2832" w:type="dxa"/>
+            <w:vAlign w:val="center"/>
+          </w:tcPr>
+          <w:p>
+            <w:pPr>
+              <w:spacing w:line="360" w:lineRule="auto"/>
+              <w:jc w:val="both"/>
+              <w:rPr>
+                <w:rFonts w:ascii="Arial" w:hAnsi="Arial" w:cs="Arial"/>
+                <w:sz w:val="24"/>
+                <w:szCs w:val="24"/>
+                <w:lang w:val="es-ES" w:eastAsia="es-ES"/>
+              </w:rPr>
+            </w:pPr>
+          </w:p>
+        </w:tc>
+      </w:tr>
     </w:tbl>
     <w:p>
       <w:pPr>
@@ -1617,27 +1476,7 @@
           <w:szCs w:val="24"/>
           <w:lang w:val="es-ES" w:eastAsia="es-ES"/>
         </w:rPr>
-        <w:t xml:space="preserve">Tipografía: Montserrat (títulos) y </w:t>
-      </w:r>
-      <w:proofErr w:type="spellStart"/>
-      <w:r>
-        <w:rPr>
-          <w:rFonts w:ascii="Arial" w:hAnsi="Arial" w:cs="Arial"/>
-          <w:sz w:val="24"/>
-          <w:szCs w:val="24"/>
-          <w:lang w:val="es-ES" w:eastAsia="es-ES"/>
-        </w:rPr>
-        <w:t>Roboto</w:t>
-      </w:r>
-      <w:proofErr w:type="spellEnd"/>
-      <w:r>
-        <w:rPr>
-          <w:rFonts w:ascii="Arial" w:hAnsi="Arial" w:cs="Arial"/>
-          <w:sz w:val="24"/>
-          <w:szCs w:val="24"/>
-          <w:lang w:val="es-ES" w:eastAsia="es-ES"/>
-        </w:rPr>
-        <w:t xml:space="preserve"> (cuerpo).</w:t>
+        <w:t>Tipografía: Montserrat (títulos) y Roboto (cuerpo).</w:t>
       </w:r>
     </w:p>
     <w:p>
@@ -1676,31 +1515,7 @@
           <w:szCs w:val="24"/>
           <w:lang w:val="es-ES" w:eastAsia="es-ES"/>
         </w:rPr>
-        <w:t xml:space="preserve">4.2. Componente: </w:t>
-      </w:r>
-      <w:proofErr w:type="spellStart"/>
-      <w:r>
-        <w:rPr>
-          <w:rFonts w:ascii="Arial" w:hAnsi="Arial" w:cs="Arial"/>
-          <w:b/>
-          <w:bCs/>
-          <w:sz w:val="24"/>
-          <w:szCs w:val="24"/>
-          <w:lang w:val="es-ES" w:eastAsia="es-ES"/>
-        </w:rPr>
-        <w:t>About</w:t>
-      </w:r>
-      <w:proofErr w:type="spellEnd"/>
-      <w:r>
-        <w:rPr>
-          <w:rFonts w:ascii="Arial" w:hAnsi="Arial" w:cs="Arial"/>
-          <w:b/>
-          <w:bCs/>
-          <w:sz w:val="24"/>
-          <w:szCs w:val="24"/>
-          <w:lang w:val="es-ES" w:eastAsia="es-ES"/>
-        </w:rPr>
-        <w:t xml:space="preserve"> (Nuestra Razón de Ser)</w:t>
+        <w:t>4.2. Componente: About (Nuestra Razón de Ser)</w:t>
       </w:r>
     </w:p>
     <w:p>
@@ -1726,47 +1541,7 @@
           <w:szCs w:val="24"/>
           <w:lang w:val="es-ES" w:eastAsia="es-ES"/>
         </w:rPr>
-        <w:t xml:space="preserve">Ubicado en </w:t>
-      </w:r>
-      <w:proofErr w:type="spellStart"/>
-      <w:r>
-        <w:rPr>
-          <w:rFonts w:ascii="Arial" w:hAnsi="Arial" w:cs="Arial"/>
-          <w:sz w:val="24"/>
-          <w:szCs w:val="24"/>
-          <w:lang w:val="es-ES" w:eastAsia="es-ES"/>
-        </w:rPr>
-        <w:t>components</w:t>
-      </w:r>
-      <w:proofErr w:type="spellEnd"/>
-      <w:r>
-        <w:rPr>
-          <w:rFonts w:ascii="Arial" w:hAnsi="Arial" w:cs="Arial"/>
-          <w:sz w:val="24"/>
-          <w:szCs w:val="24"/>
-          <w:lang w:val="es-ES" w:eastAsia="es-ES"/>
-        </w:rPr>
-        <w:t>/</w:t>
-      </w:r>
-      <w:proofErr w:type="spellStart"/>
-      <w:r>
-        <w:rPr>
-          <w:rFonts w:ascii="Arial" w:hAnsi="Arial" w:cs="Arial"/>
-          <w:sz w:val="24"/>
-          <w:szCs w:val="24"/>
-          <w:lang w:val="es-ES" w:eastAsia="es-ES"/>
-        </w:rPr>
-        <w:t>About.tsx</w:t>
-      </w:r>
-      <w:proofErr w:type="spellEnd"/>
-      <w:r>
-        <w:rPr>
-          <w:rFonts w:ascii="Arial" w:hAnsi="Arial" w:cs="Arial"/>
-          <w:sz w:val="24"/>
-          <w:szCs w:val="24"/>
-          <w:lang w:val="es-ES" w:eastAsia="es-ES"/>
-        </w:rPr>
-        <w:t>.</w:t>
+        <w:t>Ubicado en components/About.tsx.</w:t>
       </w:r>
     </w:p>
     <w:p>
@@ -1840,58 +1615,7 @@
           <w:szCs w:val="24"/>
           <w:lang w:val="es-ES" w:eastAsia="es-ES"/>
         </w:rPr>
-        <w:t xml:space="preserve"> Utiliza </w:t>
-      </w:r>
-      <w:proofErr w:type="spellStart"/>
-      <w:r>
-        <w:rPr>
-          <w:rFonts w:ascii="Arial" w:hAnsi="Arial" w:cs="Arial"/>
-          <w:sz w:val="24"/>
-          <w:szCs w:val="24"/>
-          <w:lang w:val="es-ES" w:eastAsia="es-ES"/>
-        </w:rPr>
-        <w:t>flex</w:t>
-      </w:r>
-      <w:proofErr w:type="spellEnd"/>
-      <w:r>
-        <w:rPr>
-          <w:rFonts w:ascii="Arial" w:hAnsi="Arial" w:cs="Arial"/>
-          <w:sz w:val="24"/>
-          <w:szCs w:val="24"/>
-          <w:lang w:val="es-ES" w:eastAsia="es-ES"/>
-        </w:rPr>
-        <w:t xml:space="preserve">-col </w:t>
-      </w:r>
-      <w:proofErr w:type="spellStart"/>
-      <w:proofErr w:type="gramStart"/>
-      <w:r>
-        <w:rPr>
-          <w:rFonts w:ascii="Arial" w:hAnsi="Arial" w:cs="Arial"/>
-          <w:sz w:val="24"/>
-          <w:szCs w:val="24"/>
-          <w:lang w:val="es-ES" w:eastAsia="es-ES"/>
-        </w:rPr>
-        <w:t>lg:flex</w:t>
-      </w:r>
-      <w:proofErr w:type="gramEnd"/>
-      <w:r>
-        <w:rPr>
-          <w:rFonts w:ascii="Arial" w:hAnsi="Arial" w:cs="Arial"/>
-          <w:sz w:val="24"/>
-          <w:szCs w:val="24"/>
-          <w:lang w:val="es-ES" w:eastAsia="es-ES"/>
-        </w:rPr>
-        <w:t>-row</w:t>
-      </w:r>
-      <w:proofErr w:type="spellEnd"/>
-      <w:r>
-        <w:rPr>
-          <w:rFonts w:ascii="Arial" w:hAnsi="Arial" w:cs="Arial"/>
-          <w:sz w:val="24"/>
-          <w:szCs w:val="24"/>
-          <w:lang w:val="es-ES" w:eastAsia="es-ES"/>
-        </w:rPr>
-        <w:t xml:space="preserve"> para adaptar el contenido de móvil a escritorio automáticamente.</w:t>
+        <w:t xml:space="preserve"> Utiliza flex-col lg:flex-row para adaptar el contenido de móvil a escritorio automáticamente.</w:t>
       </w:r>
     </w:p>
     <w:p>
@@ -1928,27 +1652,7 @@
           <w:szCs w:val="24"/>
           <w:lang w:val="es-ES" w:eastAsia="es-ES"/>
         </w:rPr>
-        <w:t xml:space="preserve"> Un "</w:t>
-      </w:r>
-      <w:proofErr w:type="spellStart"/>
-      <w:r>
-        <w:rPr>
-          <w:rFonts w:ascii="Arial" w:hAnsi="Arial" w:cs="Arial"/>
-          <w:sz w:val="24"/>
-          <w:szCs w:val="24"/>
-          <w:lang w:val="es-ES" w:eastAsia="es-ES"/>
-        </w:rPr>
-        <w:t>Badge</w:t>
-      </w:r>
-      <w:proofErr w:type="spellEnd"/>
-      <w:r>
-        <w:rPr>
-          <w:rFonts w:ascii="Arial" w:hAnsi="Arial" w:cs="Arial"/>
-          <w:sz w:val="24"/>
-          <w:szCs w:val="24"/>
-          <w:lang w:val="es-ES" w:eastAsia="es-ES"/>
-        </w:rPr>
-        <w:t>" flotante que resalta los "10+ años de logros".</w:t>
+        <w:t xml:space="preserve"> Un "Badge" flotante que resalta los "10+ años de logros".</w:t>
       </w:r>
     </w:p>
     <w:p>
@@ -1973,31 +1677,7 @@
           <w:szCs w:val="24"/>
           <w:lang w:val="es-ES" w:eastAsia="es-ES"/>
         </w:rPr>
-        <w:t xml:space="preserve">4.3. Componente: </w:t>
-      </w:r>
-      <w:proofErr w:type="spellStart"/>
-      <w:r>
-        <w:rPr>
-          <w:rFonts w:ascii="Arial" w:hAnsi="Arial" w:cs="Arial"/>
-          <w:b/>
-          <w:bCs/>
-          <w:sz w:val="24"/>
-          <w:szCs w:val="24"/>
-          <w:lang w:val="es-ES" w:eastAsia="es-ES"/>
-        </w:rPr>
-        <w:t>Contact</w:t>
-      </w:r>
-      <w:proofErr w:type="spellEnd"/>
-      <w:r>
-        <w:rPr>
-          <w:rFonts w:ascii="Arial" w:hAnsi="Arial" w:cs="Arial"/>
-          <w:b/>
-          <w:bCs/>
-          <w:sz w:val="24"/>
-          <w:szCs w:val="24"/>
-          <w:lang w:val="es-ES" w:eastAsia="es-ES"/>
-        </w:rPr>
-        <w:t xml:space="preserve"> (Módulo de Interacción)</w:t>
+        <w:t>4.3. Componente: Contact (Módulo de Interacción)</w:t>
       </w:r>
     </w:p>
     <w:p>
@@ -2023,47 +1703,7 @@
           <w:szCs w:val="24"/>
           <w:lang w:val="es-ES" w:eastAsia="es-ES"/>
         </w:rPr>
-        <w:t xml:space="preserve">Ubicado en </w:t>
-      </w:r>
-      <w:proofErr w:type="spellStart"/>
-      <w:r>
-        <w:rPr>
-          <w:rFonts w:ascii="Arial" w:hAnsi="Arial" w:cs="Arial"/>
-          <w:sz w:val="24"/>
-          <w:szCs w:val="24"/>
-          <w:lang w:val="es-ES" w:eastAsia="es-ES"/>
-        </w:rPr>
-        <w:t>components</w:t>
-      </w:r>
-      <w:proofErr w:type="spellEnd"/>
-      <w:r>
-        <w:rPr>
-          <w:rFonts w:ascii="Arial" w:hAnsi="Arial" w:cs="Arial"/>
-          <w:sz w:val="24"/>
-          <w:szCs w:val="24"/>
-          <w:lang w:val="es-ES" w:eastAsia="es-ES"/>
-        </w:rPr>
-        <w:t>/</w:t>
-      </w:r>
-      <w:proofErr w:type="spellStart"/>
-      <w:r>
-        <w:rPr>
-          <w:rFonts w:ascii="Arial" w:hAnsi="Arial" w:cs="Arial"/>
-          <w:sz w:val="24"/>
-          <w:szCs w:val="24"/>
-          <w:lang w:val="es-ES" w:eastAsia="es-ES"/>
-        </w:rPr>
-        <w:t>Contact.tsx</w:t>
-      </w:r>
-      <w:proofErr w:type="spellEnd"/>
-      <w:r>
-        <w:rPr>
-          <w:rFonts w:ascii="Arial" w:hAnsi="Arial" w:cs="Arial"/>
-          <w:sz w:val="24"/>
-          <w:szCs w:val="24"/>
-          <w:lang w:val="es-ES" w:eastAsia="es-ES"/>
-        </w:rPr>
-        <w:t>.</w:t>
+        <w:t>Ubicado en components/Contact.tsx.</w:t>
       </w:r>
     </w:p>
     <w:p>
@@ -2128,60 +1768,16 @@
           <w:szCs w:val="24"/>
           <w:lang w:val="es-ES" w:eastAsia="es-ES"/>
         </w:rPr>
-        <w:t xml:space="preserve">Lógica de </w:t>
-      </w:r>
-      <w:proofErr w:type="spellStart"/>
-      <w:r>
-        <w:rPr>
-          <w:rFonts w:ascii="Arial" w:hAnsi="Arial" w:cs="Arial"/>
-          <w:b/>
-          <w:bCs/>
-          <w:sz w:val="24"/>
-          <w:szCs w:val="24"/>
-          <w:lang w:val="es-ES" w:eastAsia="es-ES"/>
-        </w:rPr>
-        <w:t>React</w:t>
-      </w:r>
-      <w:proofErr w:type="spellEnd"/>
-      <w:r>
-        <w:rPr>
-          <w:rFonts w:ascii="Arial" w:hAnsi="Arial" w:cs="Arial"/>
-          <w:b/>
-          <w:bCs/>
-          <w:sz w:val="24"/>
-          <w:szCs w:val="24"/>
-          <w:lang w:val="es-ES" w:eastAsia="es-ES"/>
-        </w:rPr>
-        <w:t>:</w:t>
-      </w:r>
-      <w:r>
-        <w:rPr>
-          <w:rFonts w:ascii="Arial" w:hAnsi="Arial" w:cs="Arial"/>
-          <w:sz w:val="24"/>
-          <w:szCs w:val="24"/>
-          <w:lang w:val="es-ES" w:eastAsia="es-ES"/>
-        </w:rPr>
-        <w:t xml:space="preserve"> Utiliza el Hook </w:t>
-      </w:r>
-      <w:proofErr w:type="spellStart"/>
-      <w:r>
-        <w:rPr>
-          <w:rFonts w:ascii="Arial" w:hAnsi="Arial" w:cs="Arial"/>
-          <w:sz w:val="24"/>
-          <w:szCs w:val="24"/>
-          <w:lang w:val="es-ES" w:eastAsia="es-ES"/>
-        </w:rPr>
-        <w:t>useState</w:t>
-      </w:r>
-      <w:proofErr w:type="spellEnd"/>
-      <w:r>
-        <w:rPr>
-          <w:rFonts w:ascii="Arial" w:hAnsi="Arial" w:cs="Arial"/>
-          <w:sz w:val="24"/>
-          <w:szCs w:val="24"/>
-          <w:lang w:val="es-ES" w:eastAsia="es-ES"/>
-        </w:rPr>
-        <w:t xml:space="preserve"> para crear un "Componente Controlado".</w:t>
+        <w:t>Lógica de React:</w:t>
+      </w:r>
+      <w:r>
+        <w:rPr>
+          <w:rFonts w:ascii="Arial" w:hAnsi="Arial" w:cs="Arial"/>
+          <w:sz w:val="24"/>
+          <w:szCs w:val="24"/>
+          <w:lang w:val="es-ES" w:eastAsia="es-ES"/>
+        </w:rPr>
+        <w:t xml:space="preserve"> Utiliza el Hook useState para crear un "Componente Controlado".</w:t>
       </w:r>
     </w:p>
     <w:p>
@@ -2219,67 +1815,7 @@
           <w:szCs w:val="24"/>
           <w:lang w:val="es-ES" w:eastAsia="es-ES"/>
         </w:rPr>
-        <w:t xml:space="preserve"> Al enviar, el estado </w:t>
-      </w:r>
-      <w:proofErr w:type="spellStart"/>
-      <w:r>
-        <w:rPr>
-          <w:rFonts w:ascii="Arial" w:hAnsi="Arial" w:cs="Arial"/>
-          <w:sz w:val="24"/>
-          <w:szCs w:val="24"/>
-          <w:lang w:val="es-ES" w:eastAsia="es-ES"/>
-        </w:rPr>
-        <w:t>submitted</w:t>
-      </w:r>
-      <w:proofErr w:type="spellEnd"/>
-      <w:r>
-        <w:rPr>
-          <w:rFonts w:ascii="Arial" w:hAnsi="Arial" w:cs="Arial"/>
-          <w:sz w:val="24"/>
-          <w:szCs w:val="24"/>
-          <w:lang w:val="es-ES" w:eastAsia="es-ES"/>
-        </w:rPr>
-        <w:t xml:space="preserve"> cambia a true, ocultando el formulario y mostrando un mensaje de éxito con animación </w:t>
-      </w:r>
-      <w:proofErr w:type="spellStart"/>
-      <w:r>
-        <w:rPr>
-          <w:rFonts w:ascii="Arial" w:hAnsi="Arial" w:cs="Arial"/>
-          <w:sz w:val="24"/>
-          <w:szCs w:val="24"/>
-          <w:lang w:val="es-ES" w:eastAsia="es-ES"/>
-        </w:rPr>
-        <w:t>animate</w:t>
-      </w:r>
-      <w:proofErr w:type="spellEnd"/>
-      <w:r>
-        <w:rPr>
-          <w:rFonts w:ascii="Arial" w:hAnsi="Arial" w:cs="Arial"/>
-          <w:sz w:val="24"/>
-          <w:szCs w:val="24"/>
-          <w:lang w:val="es-ES" w:eastAsia="es-ES"/>
-        </w:rPr>
-        <w:t>-</w:t>
-      </w:r>
-      <w:proofErr w:type="spellStart"/>
-      <w:r>
-        <w:rPr>
-          <w:rFonts w:ascii="Arial" w:hAnsi="Arial" w:cs="Arial"/>
-          <w:sz w:val="24"/>
-          <w:szCs w:val="24"/>
-          <w:lang w:val="es-ES" w:eastAsia="es-ES"/>
-        </w:rPr>
-        <w:t>fade</w:t>
-      </w:r>
-      <w:proofErr w:type="spellEnd"/>
-      <w:r>
-        <w:rPr>
-          <w:rFonts w:ascii="Arial" w:hAnsi="Arial" w:cs="Arial"/>
-          <w:sz w:val="24"/>
-          <w:szCs w:val="24"/>
-          <w:lang w:val="es-ES" w:eastAsia="es-ES"/>
-        </w:rPr>
-        <w:t>-up.</w:t>
+        <w:t xml:space="preserve"> Al enviar, el estado submitted cambia a true, ocultando el formulario y mostrando un mensaje de éxito con animación animate-fade-up.</w:t>
       </w:r>
     </w:p>
     <w:p>
@@ -2374,87 +1910,7 @@
           <w:szCs w:val="24"/>
           <w:lang w:val="es-ES" w:eastAsia="es-ES"/>
         </w:rPr>
-        <w:t xml:space="preserve"> Los componentes de </w:t>
-      </w:r>
-      <w:proofErr w:type="spellStart"/>
-      <w:r>
-        <w:rPr>
-          <w:rFonts w:ascii="Arial" w:hAnsi="Arial" w:cs="Arial"/>
-          <w:sz w:val="24"/>
-          <w:szCs w:val="24"/>
-          <w:lang w:val="es-ES" w:eastAsia="es-ES"/>
-        </w:rPr>
-        <w:t>React</w:t>
-      </w:r>
-      <w:proofErr w:type="spellEnd"/>
-      <w:r>
-        <w:rPr>
-          <w:rFonts w:ascii="Arial" w:hAnsi="Arial" w:cs="Arial"/>
-          <w:sz w:val="24"/>
-          <w:szCs w:val="24"/>
-          <w:lang w:val="es-ES" w:eastAsia="es-ES"/>
-        </w:rPr>
-        <w:t xml:space="preserve"> están envueltos en secciones con </w:t>
-      </w:r>
-      <w:proofErr w:type="spellStart"/>
-      <w:r>
-        <w:rPr>
-          <w:rFonts w:ascii="Arial" w:hAnsi="Arial" w:cs="Arial"/>
-          <w:sz w:val="24"/>
-          <w:szCs w:val="24"/>
-          <w:lang w:val="es-ES" w:eastAsia="es-ES"/>
-        </w:rPr>
-        <w:t>IDs</w:t>
-      </w:r>
-      <w:proofErr w:type="spellEnd"/>
-      <w:r>
-        <w:rPr>
-          <w:rFonts w:ascii="Arial" w:hAnsi="Arial" w:cs="Arial"/>
-          <w:sz w:val="24"/>
-          <w:szCs w:val="24"/>
-          <w:lang w:val="es-ES" w:eastAsia="es-ES"/>
-        </w:rPr>
-        <w:t xml:space="preserve"> específicos (ej. &lt;</w:t>
-      </w:r>
-      <w:proofErr w:type="spellStart"/>
-      <w:r>
-        <w:rPr>
-          <w:rFonts w:ascii="Arial" w:hAnsi="Arial" w:cs="Arial"/>
-          <w:sz w:val="24"/>
-          <w:szCs w:val="24"/>
-          <w:lang w:val="es-ES" w:eastAsia="es-ES"/>
-        </w:rPr>
-        <w:t>section</w:t>
-      </w:r>
-      <w:proofErr w:type="spellEnd"/>
-      <w:r>
-        <w:rPr>
-          <w:rFonts w:ascii="Arial" w:hAnsi="Arial" w:cs="Arial"/>
-          <w:sz w:val="24"/>
-          <w:szCs w:val="24"/>
-          <w:lang w:val="es-ES" w:eastAsia="es-ES"/>
-        </w:rPr>
-        <w:t xml:space="preserve"> id="contacto"&gt;). Los botones en base.html usan anclas (</w:t>
-      </w:r>
-      <w:proofErr w:type="spellStart"/>
-      <w:r>
-        <w:rPr>
-          <w:rFonts w:ascii="Arial" w:hAnsi="Arial" w:cs="Arial"/>
-          <w:sz w:val="24"/>
-          <w:szCs w:val="24"/>
-          <w:lang w:val="es-ES" w:eastAsia="es-ES"/>
-        </w:rPr>
-        <w:t>href</w:t>
-      </w:r>
-      <w:proofErr w:type="spellEnd"/>
-      <w:r>
-        <w:rPr>
-          <w:rFonts w:ascii="Arial" w:hAnsi="Arial" w:cs="Arial"/>
-          <w:sz w:val="24"/>
-          <w:szCs w:val="24"/>
-          <w:lang w:val="es-ES" w:eastAsia="es-ES"/>
-        </w:rPr>
-        <w:t>="#contacto") para dirigir al usuario.</w:t>
+        <w:t xml:space="preserve"> Los componentes de React están envueltos en secciones con IDs específicos (ej. &lt;section id="contacto"&gt;). Los botones en base.html usan anclas (href="#contacto") para dirigir al usuario.</w:t>
       </w:r>
     </w:p>
     <w:p>
@@ -2491,67 +1947,7 @@
           <w:szCs w:val="24"/>
           <w:lang w:val="es-ES" w:eastAsia="es-ES"/>
         </w:rPr>
-        <w:t xml:space="preserve"> El archivo compilado generado por </w:t>
-      </w:r>
-      <w:proofErr w:type="spellStart"/>
-      <w:r>
-        <w:rPr>
-          <w:rFonts w:ascii="Arial" w:hAnsi="Arial" w:cs="Arial"/>
-          <w:sz w:val="24"/>
-          <w:szCs w:val="24"/>
-          <w:lang w:val="es-ES" w:eastAsia="es-ES"/>
-        </w:rPr>
-        <w:t>npm</w:t>
-      </w:r>
-      <w:proofErr w:type="spellEnd"/>
-      <w:r>
-        <w:rPr>
-          <w:rFonts w:ascii="Arial" w:hAnsi="Arial" w:cs="Arial"/>
-          <w:sz w:val="24"/>
-          <w:szCs w:val="24"/>
-          <w:lang w:val="es-ES" w:eastAsia="es-ES"/>
-        </w:rPr>
-        <w:t xml:space="preserve"> run </w:t>
-      </w:r>
-      <w:proofErr w:type="spellStart"/>
-      <w:r>
-        <w:rPr>
-          <w:rFonts w:ascii="Arial" w:hAnsi="Arial" w:cs="Arial"/>
-          <w:sz w:val="24"/>
-          <w:szCs w:val="24"/>
-          <w:lang w:val="es-ES" w:eastAsia="es-ES"/>
-        </w:rPr>
-        <w:t>build</w:t>
-      </w:r>
-      <w:proofErr w:type="spellEnd"/>
-      <w:r>
-        <w:rPr>
-          <w:rFonts w:ascii="Arial" w:hAnsi="Arial" w:cs="Arial"/>
-          <w:sz w:val="24"/>
-          <w:szCs w:val="24"/>
-          <w:lang w:val="es-ES" w:eastAsia="es-ES"/>
-        </w:rPr>
-        <w:t xml:space="preserve"> (ubicado en la carpeta /</w:t>
-      </w:r>
-      <w:proofErr w:type="spellStart"/>
-      <w:r>
-        <w:rPr>
-          <w:rFonts w:ascii="Arial" w:hAnsi="Arial" w:cs="Arial"/>
-          <w:sz w:val="24"/>
-          <w:szCs w:val="24"/>
-          <w:lang w:val="es-ES" w:eastAsia="es-ES"/>
-        </w:rPr>
-        <w:t>dist</w:t>
-      </w:r>
-      <w:proofErr w:type="spellEnd"/>
-      <w:r>
-        <w:rPr>
-          <w:rFonts w:ascii="Arial" w:hAnsi="Arial" w:cs="Arial"/>
-          <w:sz w:val="24"/>
-          <w:szCs w:val="24"/>
-          <w:lang w:val="es-ES" w:eastAsia="es-ES"/>
-        </w:rPr>
-        <w:t>) debe ser incluido en las etiquetas &lt;script&gt; del base.html.</w:t>
+        <w:t xml:space="preserve"> El archivo compilado generado por npm run build (ubicado en la carpeta /dist) debe ser incluido en las etiquetas &lt;script&gt; del base.html.</w:t>
       </w:r>
     </w:p>
     <w:p>
@@ -2616,91 +2012,16 @@
           <w:szCs w:val="24"/>
           <w:lang w:val="es-ES" w:eastAsia="es-ES"/>
         </w:rPr>
-        <w:t xml:space="preserve">API </w:t>
-      </w:r>
-      <w:proofErr w:type="spellStart"/>
-      <w:r>
-        <w:rPr>
-          <w:rFonts w:ascii="Arial" w:hAnsi="Arial" w:cs="Arial"/>
-          <w:b/>
-          <w:bCs/>
-          <w:sz w:val="24"/>
-          <w:szCs w:val="24"/>
-          <w:lang w:val="es-ES" w:eastAsia="es-ES"/>
-        </w:rPr>
-        <w:t>Keys</w:t>
-      </w:r>
-      <w:proofErr w:type="spellEnd"/>
-      <w:r>
-        <w:rPr>
-          <w:rFonts w:ascii="Arial" w:hAnsi="Arial" w:cs="Arial"/>
-          <w:b/>
-          <w:bCs/>
-          <w:sz w:val="24"/>
-          <w:szCs w:val="24"/>
-          <w:lang w:val="es-ES" w:eastAsia="es-ES"/>
-        </w:rPr>
-        <w:t>:</w:t>
-      </w:r>
-      <w:r>
-        <w:rPr>
-          <w:rFonts w:ascii="Arial" w:hAnsi="Arial" w:cs="Arial"/>
-          <w:sz w:val="24"/>
-          <w:szCs w:val="24"/>
-          <w:lang w:val="es-ES" w:eastAsia="es-ES"/>
-        </w:rPr>
-        <w:t xml:space="preserve"> La llave de Google </w:t>
-      </w:r>
-      <w:proofErr w:type="spellStart"/>
-      <w:r>
-        <w:rPr>
-          <w:rFonts w:ascii="Arial" w:hAnsi="Arial" w:cs="Arial"/>
-          <w:sz w:val="24"/>
-          <w:szCs w:val="24"/>
-          <w:lang w:val="es-ES" w:eastAsia="es-ES"/>
-        </w:rPr>
-        <w:t>GenAI</w:t>
-      </w:r>
-      <w:proofErr w:type="spellEnd"/>
-      <w:r>
-        <w:rPr>
-          <w:rFonts w:ascii="Arial" w:hAnsi="Arial" w:cs="Arial"/>
-          <w:sz w:val="24"/>
-          <w:szCs w:val="24"/>
-          <w:lang w:val="es-ES" w:eastAsia="es-ES"/>
-        </w:rPr>
-        <w:t xml:space="preserve"> debe almacenarse en un </w:t>
-      </w:r>
-      <w:proofErr w:type="gramStart"/>
-      <w:r>
-        <w:rPr>
-          <w:rFonts w:ascii="Arial" w:hAnsi="Arial" w:cs="Arial"/>
-          <w:sz w:val="24"/>
-          <w:szCs w:val="24"/>
-          <w:lang w:val="es-ES" w:eastAsia="es-ES"/>
-        </w:rPr>
-        <w:t>archivo .</w:t>
-      </w:r>
-      <w:proofErr w:type="spellStart"/>
-      <w:r>
-        <w:rPr>
-          <w:rFonts w:ascii="Arial" w:hAnsi="Arial" w:cs="Arial"/>
-          <w:sz w:val="24"/>
-          <w:szCs w:val="24"/>
-          <w:lang w:val="es-ES" w:eastAsia="es-ES"/>
-        </w:rPr>
-        <w:t>env</w:t>
-      </w:r>
-      <w:proofErr w:type="spellEnd"/>
-      <w:proofErr w:type="gramEnd"/>
-      <w:r>
-        <w:rPr>
-          <w:rFonts w:ascii="Arial" w:hAnsi="Arial" w:cs="Arial"/>
-          <w:sz w:val="24"/>
-          <w:szCs w:val="24"/>
-          <w:lang w:val="es-ES" w:eastAsia="es-ES"/>
-        </w:rPr>
-        <w:t xml:space="preserve"> y nunca subirse a repositorios públicos.</w:t>
+        <w:t>API Keys:</w:t>
+      </w:r>
+      <w:r>
+        <w:rPr>
+          <w:rFonts w:ascii="Arial" w:hAnsi="Arial" w:cs="Arial"/>
+          <w:sz w:val="24"/>
+          <w:szCs w:val="24"/>
+          <w:lang w:val="es-ES" w:eastAsia="es-ES"/>
+        </w:rPr>
+        <w:t xml:space="preserve"> La llave de Google GenAI debe almacenarse en un archivo .env y nunca subirse a repositorios públicos.</w:t>
       </w:r>
     </w:p>
     <w:p>
@@ -2737,47 +2058,7 @@
           <w:szCs w:val="24"/>
           <w:lang w:val="es-ES" w:eastAsia="es-ES"/>
         </w:rPr>
-        <w:t xml:space="preserve"> Se recomienda ejecutar </w:t>
-      </w:r>
-      <w:proofErr w:type="spellStart"/>
-      <w:r>
-        <w:rPr>
-          <w:rFonts w:ascii="Arial" w:hAnsi="Arial" w:cs="Arial"/>
-          <w:sz w:val="24"/>
-          <w:szCs w:val="24"/>
-          <w:lang w:val="es-ES" w:eastAsia="es-ES"/>
-        </w:rPr>
-        <w:t>npm</w:t>
-      </w:r>
-      <w:proofErr w:type="spellEnd"/>
-      <w:r>
-        <w:rPr>
-          <w:rFonts w:ascii="Arial" w:hAnsi="Arial" w:cs="Arial"/>
-          <w:sz w:val="24"/>
-          <w:szCs w:val="24"/>
-          <w:lang w:val="es-ES" w:eastAsia="es-ES"/>
-        </w:rPr>
-        <w:t xml:space="preserve"> </w:t>
-      </w:r>
-      <w:proofErr w:type="spellStart"/>
-      <w:r>
-        <w:rPr>
-          <w:rFonts w:ascii="Arial" w:hAnsi="Arial" w:cs="Arial"/>
-          <w:sz w:val="24"/>
-          <w:szCs w:val="24"/>
-          <w:lang w:val="es-ES" w:eastAsia="es-ES"/>
-        </w:rPr>
-        <w:t>update</w:t>
-      </w:r>
-      <w:proofErr w:type="spellEnd"/>
-      <w:r>
-        <w:rPr>
-          <w:rFonts w:ascii="Arial" w:hAnsi="Arial" w:cs="Arial"/>
-          <w:sz w:val="24"/>
-          <w:szCs w:val="24"/>
-          <w:lang w:val="es-ES" w:eastAsia="es-ES"/>
-        </w:rPr>
-        <w:t xml:space="preserve"> periódicamente para mantener las librerías de seguridad al día.</w:t>
+        <w:t xml:space="preserve"> Se recomienda ejecutar npm update periódicamente para mantener las librerías de seguridad al día.</w:t>
       </w:r>
     </w:p>
     <w:p>
@@ -2814,49 +2095,7 @@
           <w:szCs w:val="24"/>
           <w:lang w:val="es-ES" w:eastAsia="es-ES"/>
         </w:rPr>
-        <w:t xml:space="preserve"> Actualmente, el proyecto usa </w:t>
-      </w:r>
-      <w:proofErr w:type="spellStart"/>
-      <w:proofErr w:type="gramStart"/>
-      <w:r>
-        <w:rPr>
-          <w:rFonts w:ascii="Arial" w:hAnsi="Arial" w:cs="Arial"/>
-          <w:sz w:val="24"/>
-          <w:szCs w:val="24"/>
-          <w:lang w:val="es-ES" w:eastAsia="es-ES"/>
-        </w:rPr>
-        <w:t>picsum.photos</w:t>
-      </w:r>
-      <w:proofErr w:type="spellEnd"/>
-      <w:proofErr w:type="gramEnd"/>
-      <w:r>
-        <w:rPr>
-          <w:rFonts w:ascii="Arial" w:hAnsi="Arial" w:cs="Arial"/>
-          <w:sz w:val="24"/>
-          <w:szCs w:val="24"/>
-          <w:lang w:val="es-ES" w:eastAsia="es-ES"/>
-        </w:rPr>
-        <w:t xml:space="preserve"> para rellenos visuales. Deben ser sustituidas por imágenes institucionales en la carpeta /</w:t>
-      </w:r>
-      <w:proofErr w:type="spellStart"/>
-      <w:r>
-        <w:rPr>
-          <w:rFonts w:ascii="Arial" w:hAnsi="Arial" w:cs="Arial"/>
-          <w:sz w:val="24"/>
-          <w:szCs w:val="24"/>
-          <w:lang w:val="es-ES" w:eastAsia="es-ES"/>
-        </w:rPr>
-        <w:t>public</w:t>
-      </w:r>
-      <w:proofErr w:type="spellEnd"/>
-      <w:r>
-        <w:rPr>
-          <w:rFonts w:ascii="Arial" w:hAnsi="Arial" w:cs="Arial"/>
-          <w:sz w:val="24"/>
-          <w:szCs w:val="24"/>
-          <w:lang w:val="es-ES" w:eastAsia="es-ES"/>
-        </w:rPr>
-        <w:t>.</w:t>
+        <w:t xml:space="preserve"> Actualmente, el proyecto usa picsum.photos para rellenos visuales. Deben ser sustituidas por imágenes institucionales en la carpeta /public.</w:t>
       </w:r>
     </w:p>
     <w:p>

</xml_diff>